<commit_message>
Full Sefer RH 5784
</commit_message>
<xml_diff>
--- a/Files/06 - Yom Tov/09 - Rosh Hashana/5784/Rosh Hashana 5784.docx
+++ b/Files/06 - Yom Tov/09 - Rosh Hashana/5784/Rosh Hashana 5784.docx
@@ -85,7 +85,7 @@
           <w:rFonts w:ascii="Times New Roman" w:hAnsi="Times New Roman" w:cs="Times New Roman"/>
           <w:rtl/>
         </w:rPr>
-        <w:t>"</w:t>
+        <w:t>״</w:t>
       </w:r>
       <w:r>
         <w:rPr>
@@ -1789,7 +1789,7 @@
           <w:rFonts w:ascii="Times New Roman" w:hAnsi="Times New Roman" w:cs="Times New Roman"/>
           <w:rtl/>
         </w:rPr>
-        <w:t>"</w:t>
+        <w:t>״</w:t>
       </w:r>
       <w:r>
         <w:rPr>

</xml_diff>